<commit_message>
TC-159: code refactoring and bug fixing
</commit_message>
<xml_diff>
--- a/java-thesis-checker/src/test/resources/incorrect_alignment.docx
+++ b/java-thesis-checker/src/test/resources/incorrect_alignment.docx
@@ -31,7 +31,7 @@
     </w:p>
     <w:p>
       <w:pPr>
-        <w:pStyle w:val="a0"/>
+        <w:pStyle w:val="NoSpacing"/>
         <w:rPr>
           <w:lang w:val="uk-UA"/>
         </w:rPr>
@@ -40,27 +40,47 @@
         <w:rPr>
           <w:lang w:val="uk-UA"/>
         </w:rPr>
-        <w:t xml:space="preserve">Текст з не вірним вирівнюванням, </w:t>
-      </w:r>
-      <w:r>
-        <w:rPr>
-          <w:lang w:val="uk-UA"/>
-        </w:rPr>
-        <w:t xml:space="preserve">встановлено </w:t>
-      </w:r>
-      <w:r>
-        <w:rPr>
-          <w:lang w:val="uk-UA"/>
-        </w:rPr>
-        <w:t>через стилі</w:t>
+        <w:t>Текст з не вірним вирівнюванням, встановлено через стилі</w:t>
       </w:r>
     </w:p>
     <w:p>
       <w:pPr>
-        <w:pStyle w:val="1"/>
+        <w:pStyle w:val="Heading1"/>
+        <w:rPr>
+          <w:lang w:val="uk-UA"/>
+        </w:rPr>
       </w:pPr>
       <w:r>
         <w:t>Текст з невірним вирівнюванням, встановлено через стиль які успадковує інший стиль</w:t>
+      </w:r>
+    </w:p>
+    <w:p>
+      <w:pPr>
+        <w:rPr>
+          <w:rFonts w:ascii="Times New Roman" w:hAnsi="Times New Roman"/>
+          <w:lang w:val="uk-UA"/>
+        </w:rPr>
+      </w:pPr>
+      <w:r>
+        <w:rPr>
+          <w:rFonts w:ascii="Times New Roman" w:hAnsi="Times New Roman"/>
+          <w:lang w:val="uk-UA"/>
+        </w:rPr>
+        <w:t>V = S/t (1.</w:t>
+      </w:r>
+      <w:r>
+        <w:rPr>
+          <w:rFonts w:ascii="Times New Roman" w:hAnsi="Times New Roman"/>
+          <w:lang w:val="ru-RU"/>
+        </w:rPr>
+        <w:t>5</w:t>
+      </w:r>
+      <w:r>
+        <w:rPr>
+          <w:rFonts w:ascii="Times New Roman" w:hAnsi="Times New Roman"/>
+          <w:lang w:val="uk-UA"/>
+        </w:rPr>
+        <w:t>)</w:t>
       </w:r>
     </w:p>
     <w:sectPr>
@@ -82,7 +102,7 @@
         <w:kern w:val="2"/>
         <w:sz w:val="24"/>
         <w:szCs w:val="24"/>
-        <w:lang w:val="ru-UA" w:eastAsia="en-US" w:bidi="ar-SA"/>
+        <w:lang w:val="en-UA" w:eastAsia="en-US" w:bidi="ar-SA"/>
         <w14:ligatures w14:val="standardContextual"/>
       </w:rPr>
     </w:rPrDefault>
@@ -470,15 +490,15 @@
     <w:lsdException w:name="Unresolved Mention" w:semiHidden="1" w:unhideWhenUsed="1"/>
     <w:lsdException w:name="Smart Link" w:semiHidden="1" w:unhideWhenUsed="1"/>
   </w:latentStyles>
-  <w:style w:type="paragraph" w:default="1" w:styleId="a">
+  <w:style w:type="paragraph" w:default="1" w:styleId="Normal">
     <w:name w:val="Normal"/>
     <w:qFormat/>
   </w:style>
-  <w:style w:type="paragraph" w:styleId="1">
+  <w:style w:type="paragraph" w:styleId="Heading1">
     <w:name w:val="heading 1"/>
-    <w:basedOn w:val="a0"/>
-    <w:next w:val="a"/>
-    <w:link w:val="10"/>
+    <w:basedOn w:val="NoSpacing"/>
+    <w:next w:val="Normal"/>
+    <w:link w:val="Heading1Char"/>
     <w:uiPriority w:val="9"/>
     <w:qFormat/>
     <w:rsid w:val="00C057C7"/>
@@ -495,11 +515,11 @@
       <w:szCs w:val="40"/>
     </w:rPr>
   </w:style>
-  <w:style w:type="paragraph" w:styleId="2">
+  <w:style w:type="paragraph" w:styleId="Heading2">
     <w:name w:val="heading 2"/>
-    <w:basedOn w:val="a"/>
-    <w:next w:val="a"/>
-    <w:link w:val="20"/>
+    <w:basedOn w:val="Normal"/>
+    <w:next w:val="Normal"/>
+    <w:link w:val="Heading2Char"/>
     <w:uiPriority w:val="9"/>
     <w:semiHidden/>
     <w:unhideWhenUsed/>
@@ -518,11 +538,11 @@
       <w:szCs w:val="32"/>
     </w:rPr>
   </w:style>
-  <w:style w:type="paragraph" w:styleId="3">
+  <w:style w:type="paragraph" w:styleId="Heading3">
     <w:name w:val="heading 3"/>
-    <w:basedOn w:val="a"/>
-    <w:next w:val="a"/>
-    <w:link w:val="30"/>
+    <w:basedOn w:val="Normal"/>
+    <w:next w:val="Normal"/>
+    <w:link w:val="Heading3Char"/>
     <w:uiPriority w:val="9"/>
     <w:semiHidden/>
     <w:unhideWhenUsed/>
@@ -541,11 +561,11 @@
       <w:szCs w:val="28"/>
     </w:rPr>
   </w:style>
-  <w:style w:type="paragraph" w:styleId="4">
+  <w:style w:type="paragraph" w:styleId="Heading4">
     <w:name w:val="heading 4"/>
-    <w:basedOn w:val="a"/>
-    <w:next w:val="a"/>
-    <w:link w:val="40"/>
+    <w:basedOn w:val="Normal"/>
+    <w:next w:val="Normal"/>
+    <w:link w:val="Heading4Char"/>
     <w:uiPriority w:val="9"/>
     <w:semiHidden/>
     <w:unhideWhenUsed/>
@@ -564,11 +584,11 @@
       <w:color w:val="0F4761" w:themeColor="accent1" w:themeShade="BF"/>
     </w:rPr>
   </w:style>
-  <w:style w:type="paragraph" w:styleId="5">
+  <w:style w:type="paragraph" w:styleId="Heading5">
     <w:name w:val="heading 5"/>
-    <w:basedOn w:val="a"/>
-    <w:next w:val="a"/>
-    <w:link w:val="50"/>
+    <w:basedOn w:val="Normal"/>
+    <w:next w:val="Normal"/>
+    <w:link w:val="Heading5Char"/>
     <w:uiPriority w:val="9"/>
     <w:semiHidden/>
     <w:unhideWhenUsed/>
@@ -585,11 +605,11 @@
       <w:color w:val="0F4761" w:themeColor="accent1" w:themeShade="BF"/>
     </w:rPr>
   </w:style>
-  <w:style w:type="paragraph" w:styleId="6">
+  <w:style w:type="paragraph" w:styleId="Heading6">
     <w:name w:val="heading 6"/>
-    <w:basedOn w:val="a"/>
-    <w:next w:val="a"/>
-    <w:link w:val="60"/>
+    <w:basedOn w:val="Normal"/>
+    <w:next w:val="Normal"/>
+    <w:link w:val="Heading6Char"/>
     <w:uiPriority w:val="9"/>
     <w:semiHidden/>
     <w:unhideWhenUsed/>
@@ -608,11 +628,11 @@
       <w:color w:val="595959" w:themeColor="text1" w:themeTint="A6"/>
     </w:rPr>
   </w:style>
-  <w:style w:type="paragraph" w:styleId="7">
+  <w:style w:type="paragraph" w:styleId="Heading7">
     <w:name w:val="heading 7"/>
-    <w:basedOn w:val="a"/>
-    <w:next w:val="a"/>
-    <w:link w:val="70"/>
+    <w:basedOn w:val="Normal"/>
+    <w:next w:val="Normal"/>
+    <w:link w:val="Heading7Char"/>
     <w:uiPriority w:val="9"/>
     <w:semiHidden/>
     <w:unhideWhenUsed/>
@@ -629,11 +649,11 @@
       <w:color w:val="595959" w:themeColor="text1" w:themeTint="A6"/>
     </w:rPr>
   </w:style>
-  <w:style w:type="paragraph" w:styleId="8">
+  <w:style w:type="paragraph" w:styleId="Heading8">
     <w:name w:val="heading 8"/>
-    <w:basedOn w:val="a"/>
-    <w:next w:val="a"/>
-    <w:link w:val="80"/>
+    <w:basedOn w:val="Normal"/>
+    <w:next w:val="Normal"/>
+    <w:link w:val="Heading8Char"/>
     <w:uiPriority w:val="9"/>
     <w:semiHidden/>
     <w:unhideWhenUsed/>
@@ -652,11 +672,11 @@
       <w:color w:val="272727" w:themeColor="text1" w:themeTint="D8"/>
     </w:rPr>
   </w:style>
-  <w:style w:type="paragraph" w:styleId="9">
+  <w:style w:type="paragraph" w:styleId="Heading9">
     <w:name w:val="heading 9"/>
-    <w:basedOn w:val="a"/>
-    <w:next w:val="a"/>
-    <w:link w:val="90"/>
+    <w:basedOn w:val="Normal"/>
+    <w:next w:val="Normal"/>
+    <w:link w:val="Heading9Char"/>
     <w:uiPriority w:val="9"/>
     <w:semiHidden/>
     <w:unhideWhenUsed/>
@@ -673,13 +693,13 @@
       <w:color w:val="272727" w:themeColor="text1" w:themeTint="D8"/>
     </w:rPr>
   </w:style>
-  <w:style w:type="character" w:default="1" w:styleId="a1">
+  <w:style w:type="character" w:default="1" w:styleId="DefaultParagraphFont">
     <w:name w:val="Default Paragraph Font"/>
     <w:uiPriority w:val="1"/>
     <w:semiHidden/>
     <w:unhideWhenUsed/>
   </w:style>
-  <w:style w:type="table" w:default="1" w:styleId="a2">
+  <w:style w:type="table" w:default="1" w:styleId="TableNormal">
     <w:name w:val="Normal Table"/>
     <w:uiPriority w:val="99"/>
     <w:semiHidden/>
@@ -694,16 +714,16 @@
       </w:tblCellMar>
     </w:tblPr>
   </w:style>
-  <w:style w:type="numbering" w:default="1" w:styleId="a3">
+  <w:style w:type="numbering" w:default="1" w:styleId="NoList">
     <w:name w:val="No List"/>
     <w:uiPriority w:val="99"/>
     <w:semiHidden/>
     <w:unhideWhenUsed/>
   </w:style>
-  <w:style w:type="character" w:customStyle="1" w:styleId="10">
-    <w:name w:val="Заголовок 1 Знак"/>
-    <w:basedOn w:val="a1"/>
-    <w:link w:val="1"/>
+  <w:style w:type="character" w:customStyle="1" w:styleId="Heading1Char">
+    <w:name w:val="Heading 1 Char"/>
+    <w:basedOn w:val="DefaultParagraphFont"/>
+    <w:link w:val="Heading1"/>
     <w:uiPriority w:val="9"/>
     <w:rsid w:val="00C057C7"/>
     <w:rPr>
@@ -713,10 +733,10 @@
       <w:szCs w:val="40"/>
     </w:rPr>
   </w:style>
-  <w:style w:type="character" w:customStyle="1" w:styleId="20">
-    <w:name w:val="Заголовок 2 Знак"/>
-    <w:basedOn w:val="a1"/>
-    <w:link w:val="2"/>
+  <w:style w:type="character" w:customStyle="1" w:styleId="Heading2Char">
+    <w:name w:val="Heading 2 Char"/>
+    <w:basedOn w:val="DefaultParagraphFont"/>
+    <w:link w:val="Heading2"/>
     <w:uiPriority w:val="9"/>
     <w:semiHidden/>
     <w:rsid w:val="00C057C7"/>
@@ -727,10 +747,10 @@
       <w:szCs w:val="32"/>
     </w:rPr>
   </w:style>
-  <w:style w:type="character" w:customStyle="1" w:styleId="30">
-    <w:name w:val="Заголовок 3 Знак"/>
-    <w:basedOn w:val="a1"/>
-    <w:link w:val="3"/>
+  <w:style w:type="character" w:customStyle="1" w:styleId="Heading3Char">
+    <w:name w:val="Heading 3 Char"/>
+    <w:basedOn w:val="DefaultParagraphFont"/>
+    <w:link w:val="Heading3"/>
     <w:uiPriority w:val="9"/>
     <w:semiHidden/>
     <w:rsid w:val="00C057C7"/>
@@ -741,10 +761,10 @@
       <w:szCs w:val="28"/>
     </w:rPr>
   </w:style>
-  <w:style w:type="character" w:customStyle="1" w:styleId="40">
-    <w:name w:val="Заголовок 4 Знак"/>
-    <w:basedOn w:val="a1"/>
-    <w:link w:val="4"/>
+  <w:style w:type="character" w:customStyle="1" w:styleId="Heading4Char">
+    <w:name w:val="Heading 4 Char"/>
+    <w:basedOn w:val="DefaultParagraphFont"/>
+    <w:link w:val="Heading4"/>
     <w:uiPriority w:val="9"/>
     <w:semiHidden/>
     <w:rsid w:val="00C057C7"/>
@@ -755,10 +775,10 @@
       <w:color w:val="0F4761" w:themeColor="accent1" w:themeShade="BF"/>
     </w:rPr>
   </w:style>
-  <w:style w:type="character" w:customStyle="1" w:styleId="50">
-    <w:name w:val="Заголовок 5 Знак"/>
-    <w:basedOn w:val="a1"/>
-    <w:link w:val="5"/>
+  <w:style w:type="character" w:customStyle="1" w:styleId="Heading5Char">
+    <w:name w:val="Heading 5 Char"/>
+    <w:basedOn w:val="DefaultParagraphFont"/>
+    <w:link w:val="Heading5"/>
     <w:uiPriority w:val="9"/>
     <w:semiHidden/>
     <w:rsid w:val="00C057C7"/>
@@ -767,10 +787,10 @@
       <w:color w:val="0F4761" w:themeColor="accent1" w:themeShade="BF"/>
     </w:rPr>
   </w:style>
-  <w:style w:type="character" w:customStyle="1" w:styleId="60">
-    <w:name w:val="Заголовок 6 Знак"/>
-    <w:basedOn w:val="a1"/>
-    <w:link w:val="6"/>
+  <w:style w:type="character" w:customStyle="1" w:styleId="Heading6Char">
+    <w:name w:val="Heading 6 Char"/>
+    <w:basedOn w:val="DefaultParagraphFont"/>
+    <w:link w:val="Heading6"/>
     <w:uiPriority w:val="9"/>
     <w:semiHidden/>
     <w:rsid w:val="00C057C7"/>
@@ -781,10 +801,10 @@
       <w:color w:val="595959" w:themeColor="text1" w:themeTint="A6"/>
     </w:rPr>
   </w:style>
-  <w:style w:type="character" w:customStyle="1" w:styleId="70">
-    <w:name w:val="Заголовок 7 Знак"/>
-    <w:basedOn w:val="a1"/>
-    <w:link w:val="7"/>
+  <w:style w:type="character" w:customStyle="1" w:styleId="Heading7Char">
+    <w:name w:val="Heading 7 Char"/>
+    <w:basedOn w:val="DefaultParagraphFont"/>
+    <w:link w:val="Heading7"/>
     <w:uiPriority w:val="9"/>
     <w:semiHidden/>
     <w:rsid w:val="00C057C7"/>
@@ -793,10 +813,10 @@
       <w:color w:val="595959" w:themeColor="text1" w:themeTint="A6"/>
     </w:rPr>
   </w:style>
-  <w:style w:type="character" w:customStyle="1" w:styleId="80">
-    <w:name w:val="Заголовок 8 Знак"/>
-    <w:basedOn w:val="a1"/>
-    <w:link w:val="8"/>
+  <w:style w:type="character" w:customStyle="1" w:styleId="Heading8Char">
+    <w:name w:val="Heading 8 Char"/>
+    <w:basedOn w:val="DefaultParagraphFont"/>
+    <w:link w:val="Heading8"/>
     <w:uiPriority w:val="9"/>
     <w:semiHidden/>
     <w:rsid w:val="00C057C7"/>
@@ -807,10 +827,10 @@
       <w:color w:val="272727" w:themeColor="text1" w:themeTint="D8"/>
     </w:rPr>
   </w:style>
-  <w:style w:type="character" w:customStyle="1" w:styleId="90">
-    <w:name w:val="Заголовок 9 Знак"/>
-    <w:basedOn w:val="a1"/>
-    <w:link w:val="9"/>
+  <w:style w:type="character" w:customStyle="1" w:styleId="Heading9Char">
+    <w:name w:val="Heading 9 Char"/>
+    <w:basedOn w:val="DefaultParagraphFont"/>
+    <w:link w:val="Heading9"/>
     <w:uiPriority w:val="9"/>
     <w:semiHidden/>
     <w:rsid w:val="00C057C7"/>
@@ -819,11 +839,11 @@
       <w:color w:val="272727" w:themeColor="text1" w:themeTint="D8"/>
     </w:rPr>
   </w:style>
-  <w:style w:type="paragraph" w:styleId="a4">
+  <w:style w:type="paragraph" w:styleId="Title">
     <w:name w:val="Title"/>
-    <w:basedOn w:val="a"/>
-    <w:next w:val="a"/>
-    <w:link w:val="a5"/>
+    <w:basedOn w:val="Normal"/>
+    <w:next w:val="Normal"/>
+    <w:link w:val="TitleChar"/>
     <w:uiPriority w:val="10"/>
     <w:qFormat/>
     <w:rsid w:val="00C057C7"/>
@@ -839,10 +859,10 @@
       <w:szCs w:val="56"/>
     </w:rPr>
   </w:style>
-  <w:style w:type="character" w:customStyle="1" w:styleId="a5">
-    <w:name w:val="Заголовок Знак"/>
-    <w:basedOn w:val="a1"/>
-    <w:link w:val="a4"/>
+  <w:style w:type="character" w:customStyle="1" w:styleId="TitleChar">
+    <w:name w:val="Title Char"/>
+    <w:basedOn w:val="DefaultParagraphFont"/>
+    <w:link w:val="Title"/>
     <w:uiPriority w:val="10"/>
     <w:rsid w:val="00C057C7"/>
     <w:rPr>
@@ -853,11 +873,11 @@
       <w:szCs w:val="56"/>
     </w:rPr>
   </w:style>
-  <w:style w:type="paragraph" w:styleId="a6">
+  <w:style w:type="paragraph" w:styleId="Subtitle">
     <w:name w:val="Subtitle"/>
-    <w:basedOn w:val="a"/>
-    <w:next w:val="a"/>
-    <w:link w:val="a7"/>
+    <w:basedOn w:val="Normal"/>
+    <w:next w:val="Normal"/>
+    <w:link w:val="SubtitleChar"/>
     <w:uiPriority w:val="11"/>
     <w:qFormat/>
     <w:rsid w:val="00C057C7"/>
@@ -874,10 +894,10 @@
       <w:szCs w:val="28"/>
     </w:rPr>
   </w:style>
-  <w:style w:type="character" w:customStyle="1" w:styleId="a7">
-    <w:name w:val="Подзаголовок Знак"/>
-    <w:basedOn w:val="a1"/>
-    <w:link w:val="a6"/>
+  <w:style w:type="character" w:customStyle="1" w:styleId="SubtitleChar">
+    <w:name w:val="Subtitle Char"/>
+    <w:basedOn w:val="DefaultParagraphFont"/>
+    <w:link w:val="Subtitle"/>
     <w:uiPriority w:val="11"/>
     <w:rsid w:val="00C057C7"/>
     <w:rPr>
@@ -888,11 +908,11 @@
       <w:szCs w:val="28"/>
     </w:rPr>
   </w:style>
-  <w:style w:type="paragraph" w:styleId="21">
+  <w:style w:type="paragraph" w:styleId="Quote">
     <w:name w:val="Quote"/>
-    <w:basedOn w:val="a"/>
-    <w:next w:val="a"/>
-    <w:link w:val="22"/>
+    <w:basedOn w:val="Normal"/>
+    <w:next w:val="Normal"/>
+    <w:link w:val="QuoteChar"/>
     <w:uiPriority w:val="29"/>
     <w:qFormat/>
     <w:rsid w:val="00C057C7"/>
@@ -906,10 +926,10 @@
       <w:color w:val="404040" w:themeColor="text1" w:themeTint="BF"/>
     </w:rPr>
   </w:style>
-  <w:style w:type="character" w:customStyle="1" w:styleId="22">
-    <w:name w:val="Цитата 2 Знак"/>
-    <w:basedOn w:val="a1"/>
-    <w:link w:val="21"/>
+  <w:style w:type="character" w:customStyle="1" w:styleId="QuoteChar">
+    <w:name w:val="Quote Char"/>
+    <w:basedOn w:val="DefaultParagraphFont"/>
+    <w:link w:val="Quote"/>
     <w:uiPriority w:val="29"/>
     <w:rsid w:val="00C057C7"/>
     <w:rPr>
@@ -918,9 +938,9 @@
       <w:color w:val="404040" w:themeColor="text1" w:themeTint="BF"/>
     </w:rPr>
   </w:style>
-  <w:style w:type="paragraph" w:styleId="a8">
+  <w:style w:type="paragraph" w:styleId="ListParagraph">
     <w:name w:val="List Paragraph"/>
-    <w:basedOn w:val="a"/>
+    <w:basedOn w:val="Normal"/>
     <w:uiPriority w:val="34"/>
     <w:qFormat/>
     <w:rsid w:val="00C057C7"/>
@@ -929,9 +949,9 @@
       <w:contextualSpacing/>
     </w:pPr>
   </w:style>
-  <w:style w:type="character" w:styleId="a9">
+  <w:style w:type="character" w:styleId="IntenseEmphasis">
     <w:name w:val="Intense Emphasis"/>
-    <w:basedOn w:val="a1"/>
+    <w:basedOn w:val="DefaultParagraphFont"/>
     <w:uiPriority w:val="21"/>
     <w:qFormat/>
     <w:rsid w:val="00C057C7"/>
@@ -941,11 +961,11 @@
       <w:color w:val="0F4761" w:themeColor="accent1" w:themeShade="BF"/>
     </w:rPr>
   </w:style>
-  <w:style w:type="paragraph" w:styleId="aa">
+  <w:style w:type="paragraph" w:styleId="IntenseQuote">
     <w:name w:val="Intense Quote"/>
-    <w:basedOn w:val="a"/>
-    <w:next w:val="a"/>
-    <w:link w:val="ab"/>
+    <w:basedOn w:val="Normal"/>
+    <w:next w:val="Normal"/>
+    <w:link w:val="IntenseQuoteChar"/>
     <w:uiPriority w:val="30"/>
     <w:qFormat/>
     <w:rsid w:val="00C057C7"/>
@@ -964,10 +984,10 @@
       <w:color w:val="0F4761" w:themeColor="accent1" w:themeShade="BF"/>
     </w:rPr>
   </w:style>
-  <w:style w:type="character" w:customStyle="1" w:styleId="ab">
-    <w:name w:val="Выделенная цитата Знак"/>
-    <w:basedOn w:val="a1"/>
-    <w:link w:val="aa"/>
+  <w:style w:type="character" w:customStyle="1" w:styleId="IntenseQuoteChar">
+    <w:name w:val="Intense Quote Char"/>
+    <w:basedOn w:val="DefaultParagraphFont"/>
+    <w:link w:val="IntenseQuote"/>
     <w:uiPriority w:val="30"/>
     <w:rsid w:val="00C057C7"/>
     <w:rPr>
@@ -976,9 +996,9 @@
       <w:color w:val="0F4761" w:themeColor="accent1" w:themeShade="BF"/>
     </w:rPr>
   </w:style>
-  <w:style w:type="character" w:styleId="ac">
+  <w:style w:type="character" w:styleId="IntenseReference">
     <w:name w:val="Intense Reference"/>
-    <w:basedOn w:val="a1"/>
+    <w:basedOn w:val="DefaultParagraphFont"/>
     <w:uiPriority w:val="32"/>
     <w:qFormat/>
     <w:rsid w:val="00C057C7"/>
@@ -990,7 +1010,7 @@
       <w:spacing w:val="5"/>
     </w:rPr>
   </w:style>
-  <w:style w:type="paragraph" w:styleId="a0">
+  <w:style w:type="paragraph" w:styleId="NoSpacing">
     <w:name w:val="No Spacing"/>
     <w:uiPriority w:val="1"/>
     <w:qFormat/>
@@ -1000,9 +1020,9 @@
       <w:jc w:val="right"/>
     </w:pPr>
   </w:style>
-  <w:style w:type="character" w:styleId="ad">
+  <w:style w:type="character" w:styleId="Emphasis">
     <w:name w:val="Emphasis"/>
-    <w:basedOn w:val="a1"/>
+    <w:basedOn w:val="DefaultParagraphFont"/>
     <w:uiPriority w:val="20"/>
     <w:qFormat/>
     <w:rsid w:val="00B71F69"/>

</xml_diff>

<commit_message>
TC-159: code refactoring and bug fixing (#69)
* TC-159: code refactoring and bug fixing

* TC-159: rename method

* TC-159: fixed the code for comments.
</commit_message>
<xml_diff>
--- a/java-thesis-checker/src/test/resources/incorrect_alignment.docx
+++ b/java-thesis-checker/src/test/resources/incorrect_alignment.docx
@@ -31,7 +31,7 @@
     </w:p>
     <w:p>
       <w:pPr>
-        <w:pStyle w:val="a0"/>
+        <w:pStyle w:val="NoSpacing"/>
         <w:rPr>
           <w:lang w:val="uk-UA"/>
         </w:rPr>
@@ -40,27 +40,47 @@
         <w:rPr>
           <w:lang w:val="uk-UA"/>
         </w:rPr>
-        <w:t xml:space="preserve">Текст з не вірним вирівнюванням, </w:t>
-      </w:r>
-      <w:r>
-        <w:rPr>
-          <w:lang w:val="uk-UA"/>
-        </w:rPr>
-        <w:t xml:space="preserve">встановлено </w:t>
-      </w:r>
-      <w:r>
-        <w:rPr>
-          <w:lang w:val="uk-UA"/>
-        </w:rPr>
-        <w:t>через стилі</w:t>
+        <w:t>Текст з не вірним вирівнюванням, встановлено через стилі</w:t>
       </w:r>
     </w:p>
     <w:p>
       <w:pPr>
-        <w:pStyle w:val="1"/>
+        <w:pStyle w:val="Heading1"/>
+        <w:rPr>
+          <w:lang w:val="uk-UA"/>
+        </w:rPr>
       </w:pPr>
       <w:r>
         <w:t>Текст з невірним вирівнюванням, встановлено через стиль які успадковує інший стиль</w:t>
+      </w:r>
+    </w:p>
+    <w:p>
+      <w:pPr>
+        <w:rPr>
+          <w:rFonts w:ascii="Times New Roman" w:hAnsi="Times New Roman"/>
+          <w:lang w:val="uk-UA"/>
+        </w:rPr>
+      </w:pPr>
+      <w:r>
+        <w:rPr>
+          <w:rFonts w:ascii="Times New Roman" w:hAnsi="Times New Roman"/>
+          <w:lang w:val="uk-UA"/>
+        </w:rPr>
+        <w:t>V = S/t (1.</w:t>
+      </w:r>
+      <w:r>
+        <w:rPr>
+          <w:rFonts w:ascii="Times New Roman" w:hAnsi="Times New Roman"/>
+          <w:lang w:val="ru-RU"/>
+        </w:rPr>
+        <w:t>5</w:t>
+      </w:r>
+      <w:r>
+        <w:rPr>
+          <w:rFonts w:ascii="Times New Roman" w:hAnsi="Times New Roman"/>
+          <w:lang w:val="uk-UA"/>
+        </w:rPr>
+        <w:t>)</w:t>
       </w:r>
     </w:p>
     <w:sectPr>
@@ -82,7 +102,7 @@
         <w:kern w:val="2"/>
         <w:sz w:val="24"/>
         <w:szCs w:val="24"/>
-        <w:lang w:val="ru-UA" w:eastAsia="en-US" w:bidi="ar-SA"/>
+        <w:lang w:val="en-UA" w:eastAsia="en-US" w:bidi="ar-SA"/>
         <w14:ligatures w14:val="standardContextual"/>
       </w:rPr>
     </w:rPrDefault>
@@ -470,15 +490,15 @@
     <w:lsdException w:name="Unresolved Mention" w:semiHidden="1" w:unhideWhenUsed="1"/>
     <w:lsdException w:name="Smart Link" w:semiHidden="1" w:unhideWhenUsed="1"/>
   </w:latentStyles>
-  <w:style w:type="paragraph" w:default="1" w:styleId="a">
+  <w:style w:type="paragraph" w:default="1" w:styleId="Normal">
     <w:name w:val="Normal"/>
     <w:qFormat/>
   </w:style>
-  <w:style w:type="paragraph" w:styleId="1">
+  <w:style w:type="paragraph" w:styleId="Heading1">
     <w:name w:val="heading 1"/>
-    <w:basedOn w:val="a0"/>
-    <w:next w:val="a"/>
-    <w:link w:val="10"/>
+    <w:basedOn w:val="NoSpacing"/>
+    <w:next w:val="Normal"/>
+    <w:link w:val="Heading1Char"/>
     <w:uiPriority w:val="9"/>
     <w:qFormat/>
     <w:rsid w:val="00C057C7"/>
@@ -495,11 +515,11 @@
       <w:szCs w:val="40"/>
     </w:rPr>
   </w:style>
-  <w:style w:type="paragraph" w:styleId="2">
+  <w:style w:type="paragraph" w:styleId="Heading2">
     <w:name w:val="heading 2"/>
-    <w:basedOn w:val="a"/>
-    <w:next w:val="a"/>
-    <w:link w:val="20"/>
+    <w:basedOn w:val="Normal"/>
+    <w:next w:val="Normal"/>
+    <w:link w:val="Heading2Char"/>
     <w:uiPriority w:val="9"/>
     <w:semiHidden/>
     <w:unhideWhenUsed/>
@@ -518,11 +538,11 @@
       <w:szCs w:val="32"/>
     </w:rPr>
   </w:style>
-  <w:style w:type="paragraph" w:styleId="3">
+  <w:style w:type="paragraph" w:styleId="Heading3">
     <w:name w:val="heading 3"/>
-    <w:basedOn w:val="a"/>
-    <w:next w:val="a"/>
-    <w:link w:val="30"/>
+    <w:basedOn w:val="Normal"/>
+    <w:next w:val="Normal"/>
+    <w:link w:val="Heading3Char"/>
     <w:uiPriority w:val="9"/>
     <w:semiHidden/>
     <w:unhideWhenUsed/>
@@ -541,11 +561,11 @@
       <w:szCs w:val="28"/>
     </w:rPr>
   </w:style>
-  <w:style w:type="paragraph" w:styleId="4">
+  <w:style w:type="paragraph" w:styleId="Heading4">
     <w:name w:val="heading 4"/>
-    <w:basedOn w:val="a"/>
-    <w:next w:val="a"/>
-    <w:link w:val="40"/>
+    <w:basedOn w:val="Normal"/>
+    <w:next w:val="Normal"/>
+    <w:link w:val="Heading4Char"/>
     <w:uiPriority w:val="9"/>
     <w:semiHidden/>
     <w:unhideWhenUsed/>
@@ -564,11 +584,11 @@
       <w:color w:val="0F4761" w:themeColor="accent1" w:themeShade="BF"/>
     </w:rPr>
   </w:style>
-  <w:style w:type="paragraph" w:styleId="5">
+  <w:style w:type="paragraph" w:styleId="Heading5">
     <w:name w:val="heading 5"/>
-    <w:basedOn w:val="a"/>
-    <w:next w:val="a"/>
-    <w:link w:val="50"/>
+    <w:basedOn w:val="Normal"/>
+    <w:next w:val="Normal"/>
+    <w:link w:val="Heading5Char"/>
     <w:uiPriority w:val="9"/>
     <w:semiHidden/>
     <w:unhideWhenUsed/>
@@ -585,11 +605,11 @@
       <w:color w:val="0F4761" w:themeColor="accent1" w:themeShade="BF"/>
     </w:rPr>
   </w:style>
-  <w:style w:type="paragraph" w:styleId="6">
+  <w:style w:type="paragraph" w:styleId="Heading6">
     <w:name w:val="heading 6"/>
-    <w:basedOn w:val="a"/>
-    <w:next w:val="a"/>
-    <w:link w:val="60"/>
+    <w:basedOn w:val="Normal"/>
+    <w:next w:val="Normal"/>
+    <w:link w:val="Heading6Char"/>
     <w:uiPriority w:val="9"/>
     <w:semiHidden/>
     <w:unhideWhenUsed/>
@@ -608,11 +628,11 @@
       <w:color w:val="595959" w:themeColor="text1" w:themeTint="A6"/>
     </w:rPr>
   </w:style>
-  <w:style w:type="paragraph" w:styleId="7">
+  <w:style w:type="paragraph" w:styleId="Heading7">
     <w:name w:val="heading 7"/>
-    <w:basedOn w:val="a"/>
-    <w:next w:val="a"/>
-    <w:link w:val="70"/>
+    <w:basedOn w:val="Normal"/>
+    <w:next w:val="Normal"/>
+    <w:link w:val="Heading7Char"/>
     <w:uiPriority w:val="9"/>
     <w:semiHidden/>
     <w:unhideWhenUsed/>
@@ -629,11 +649,11 @@
       <w:color w:val="595959" w:themeColor="text1" w:themeTint="A6"/>
     </w:rPr>
   </w:style>
-  <w:style w:type="paragraph" w:styleId="8">
+  <w:style w:type="paragraph" w:styleId="Heading8">
     <w:name w:val="heading 8"/>
-    <w:basedOn w:val="a"/>
-    <w:next w:val="a"/>
-    <w:link w:val="80"/>
+    <w:basedOn w:val="Normal"/>
+    <w:next w:val="Normal"/>
+    <w:link w:val="Heading8Char"/>
     <w:uiPriority w:val="9"/>
     <w:semiHidden/>
     <w:unhideWhenUsed/>
@@ -652,11 +672,11 @@
       <w:color w:val="272727" w:themeColor="text1" w:themeTint="D8"/>
     </w:rPr>
   </w:style>
-  <w:style w:type="paragraph" w:styleId="9">
+  <w:style w:type="paragraph" w:styleId="Heading9">
     <w:name w:val="heading 9"/>
-    <w:basedOn w:val="a"/>
-    <w:next w:val="a"/>
-    <w:link w:val="90"/>
+    <w:basedOn w:val="Normal"/>
+    <w:next w:val="Normal"/>
+    <w:link w:val="Heading9Char"/>
     <w:uiPriority w:val="9"/>
     <w:semiHidden/>
     <w:unhideWhenUsed/>
@@ -673,13 +693,13 @@
       <w:color w:val="272727" w:themeColor="text1" w:themeTint="D8"/>
     </w:rPr>
   </w:style>
-  <w:style w:type="character" w:default="1" w:styleId="a1">
+  <w:style w:type="character" w:default="1" w:styleId="DefaultParagraphFont">
     <w:name w:val="Default Paragraph Font"/>
     <w:uiPriority w:val="1"/>
     <w:semiHidden/>
     <w:unhideWhenUsed/>
   </w:style>
-  <w:style w:type="table" w:default="1" w:styleId="a2">
+  <w:style w:type="table" w:default="1" w:styleId="TableNormal">
     <w:name w:val="Normal Table"/>
     <w:uiPriority w:val="99"/>
     <w:semiHidden/>
@@ -694,16 +714,16 @@
       </w:tblCellMar>
     </w:tblPr>
   </w:style>
-  <w:style w:type="numbering" w:default="1" w:styleId="a3">
+  <w:style w:type="numbering" w:default="1" w:styleId="NoList">
     <w:name w:val="No List"/>
     <w:uiPriority w:val="99"/>
     <w:semiHidden/>
     <w:unhideWhenUsed/>
   </w:style>
-  <w:style w:type="character" w:customStyle="1" w:styleId="10">
-    <w:name w:val="Заголовок 1 Знак"/>
-    <w:basedOn w:val="a1"/>
-    <w:link w:val="1"/>
+  <w:style w:type="character" w:customStyle="1" w:styleId="Heading1Char">
+    <w:name w:val="Heading 1 Char"/>
+    <w:basedOn w:val="DefaultParagraphFont"/>
+    <w:link w:val="Heading1"/>
     <w:uiPriority w:val="9"/>
     <w:rsid w:val="00C057C7"/>
     <w:rPr>
@@ -713,10 +733,10 @@
       <w:szCs w:val="40"/>
     </w:rPr>
   </w:style>
-  <w:style w:type="character" w:customStyle="1" w:styleId="20">
-    <w:name w:val="Заголовок 2 Знак"/>
-    <w:basedOn w:val="a1"/>
-    <w:link w:val="2"/>
+  <w:style w:type="character" w:customStyle="1" w:styleId="Heading2Char">
+    <w:name w:val="Heading 2 Char"/>
+    <w:basedOn w:val="DefaultParagraphFont"/>
+    <w:link w:val="Heading2"/>
     <w:uiPriority w:val="9"/>
     <w:semiHidden/>
     <w:rsid w:val="00C057C7"/>
@@ -727,10 +747,10 @@
       <w:szCs w:val="32"/>
     </w:rPr>
   </w:style>
-  <w:style w:type="character" w:customStyle="1" w:styleId="30">
-    <w:name w:val="Заголовок 3 Знак"/>
-    <w:basedOn w:val="a1"/>
-    <w:link w:val="3"/>
+  <w:style w:type="character" w:customStyle="1" w:styleId="Heading3Char">
+    <w:name w:val="Heading 3 Char"/>
+    <w:basedOn w:val="DefaultParagraphFont"/>
+    <w:link w:val="Heading3"/>
     <w:uiPriority w:val="9"/>
     <w:semiHidden/>
     <w:rsid w:val="00C057C7"/>
@@ -741,10 +761,10 @@
       <w:szCs w:val="28"/>
     </w:rPr>
   </w:style>
-  <w:style w:type="character" w:customStyle="1" w:styleId="40">
-    <w:name w:val="Заголовок 4 Знак"/>
-    <w:basedOn w:val="a1"/>
-    <w:link w:val="4"/>
+  <w:style w:type="character" w:customStyle="1" w:styleId="Heading4Char">
+    <w:name w:val="Heading 4 Char"/>
+    <w:basedOn w:val="DefaultParagraphFont"/>
+    <w:link w:val="Heading4"/>
     <w:uiPriority w:val="9"/>
     <w:semiHidden/>
     <w:rsid w:val="00C057C7"/>
@@ -755,10 +775,10 @@
       <w:color w:val="0F4761" w:themeColor="accent1" w:themeShade="BF"/>
     </w:rPr>
   </w:style>
-  <w:style w:type="character" w:customStyle="1" w:styleId="50">
-    <w:name w:val="Заголовок 5 Знак"/>
-    <w:basedOn w:val="a1"/>
-    <w:link w:val="5"/>
+  <w:style w:type="character" w:customStyle="1" w:styleId="Heading5Char">
+    <w:name w:val="Heading 5 Char"/>
+    <w:basedOn w:val="DefaultParagraphFont"/>
+    <w:link w:val="Heading5"/>
     <w:uiPriority w:val="9"/>
     <w:semiHidden/>
     <w:rsid w:val="00C057C7"/>
@@ -767,10 +787,10 @@
       <w:color w:val="0F4761" w:themeColor="accent1" w:themeShade="BF"/>
     </w:rPr>
   </w:style>
-  <w:style w:type="character" w:customStyle="1" w:styleId="60">
-    <w:name w:val="Заголовок 6 Знак"/>
-    <w:basedOn w:val="a1"/>
-    <w:link w:val="6"/>
+  <w:style w:type="character" w:customStyle="1" w:styleId="Heading6Char">
+    <w:name w:val="Heading 6 Char"/>
+    <w:basedOn w:val="DefaultParagraphFont"/>
+    <w:link w:val="Heading6"/>
     <w:uiPriority w:val="9"/>
     <w:semiHidden/>
     <w:rsid w:val="00C057C7"/>
@@ -781,10 +801,10 @@
       <w:color w:val="595959" w:themeColor="text1" w:themeTint="A6"/>
     </w:rPr>
   </w:style>
-  <w:style w:type="character" w:customStyle="1" w:styleId="70">
-    <w:name w:val="Заголовок 7 Знак"/>
-    <w:basedOn w:val="a1"/>
-    <w:link w:val="7"/>
+  <w:style w:type="character" w:customStyle="1" w:styleId="Heading7Char">
+    <w:name w:val="Heading 7 Char"/>
+    <w:basedOn w:val="DefaultParagraphFont"/>
+    <w:link w:val="Heading7"/>
     <w:uiPriority w:val="9"/>
     <w:semiHidden/>
     <w:rsid w:val="00C057C7"/>
@@ -793,10 +813,10 @@
       <w:color w:val="595959" w:themeColor="text1" w:themeTint="A6"/>
     </w:rPr>
   </w:style>
-  <w:style w:type="character" w:customStyle="1" w:styleId="80">
-    <w:name w:val="Заголовок 8 Знак"/>
-    <w:basedOn w:val="a1"/>
-    <w:link w:val="8"/>
+  <w:style w:type="character" w:customStyle="1" w:styleId="Heading8Char">
+    <w:name w:val="Heading 8 Char"/>
+    <w:basedOn w:val="DefaultParagraphFont"/>
+    <w:link w:val="Heading8"/>
     <w:uiPriority w:val="9"/>
     <w:semiHidden/>
     <w:rsid w:val="00C057C7"/>
@@ -807,10 +827,10 @@
       <w:color w:val="272727" w:themeColor="text1" w:themeTint="D8"/>
     </w:rPr>
   </w:style>
-  <w:style w:type="character" w:customStyle="1" w:styleId="90">
-    <w:name w:val="Заголовок 9 Знак"/>
-    <w:basedOn w:val="a1"/>
-    <w:link w:val="9"/>
+  <w:style w:type="character" w:customStyle="1" w:styleId="Heading9Char">
+    <w:name w:val="Heading 9 Char"/>
+    <w:basedOn w:val="DefaultParagraphFont"/>
+    <w:link w:val="Heading9"/>
     <w:uiPriority w:val="9"/>
     <w:semiHidden/>
     <w:rsid w:val="00C057C7"/>
@@ -819,11 +839,11 @@
       <w:color w:val="272727" w:themeColor="text1" w:themeTint="D8"/>
     </w:rPr>
   </w:style>
-  <w:style w:type="paragraph" w:styleId="a4">
+  <w:style w:type="paragraph" w:styleId="Title">
     <w:name w:val="Title"/>
-    <w:basedOn w:val="a"/>
-    <w:next w:val="a"/>
-    <w:link w:val="a5"/>
+    <w:basedOn w:val="Normal"/>
+    <w:next w:val="Normal"/>
+    <w:link w:val="TitleChar"/>
     <w:uiPriority w:val="10"/>
     <w:qFormat/>
     <w:rsid w:val="00C057C7"/>
@@ -839,10 +859,10 @@
       <w:szCs w:val="56"/>
     </w:rPr>
   </w:style>
-  <w:style w:type="character" w:customStyle="1" w:styleId="a5">
-    <w:name w:val="Заголовок Знак"/>
-    <w:basedOn w:val="a1"/>
-    <w:link w:val="a4"/>
+  <w:style w:type="character" w:customStyle="1" w:styleId="TitleChar">
+    <w:name w:val="Title Char"/>
+    <w:basedOn w:val="DefaultParagraphFont"/>
+    <w:link w:val="Title"/>
     <w:uiPriority w:val="10"/>
     <w:rsid w:val="00C057C7"/>
     <w:rPr>
@@ -853,11 +873,11 @@
       <w:szCs w:val="56"/>
     </w:rPr>
   </w:style>
-  <w:style w:type="paragraph" w:styleId="a6">
+  <w:style w:type="paragraph" w:styleId="Subtitle">
     <w:name w:val="Subtitle"/>
-    <w:basedOn w:val="a"/>
-    <w:next w:val="a"/>
-    <w:link w:val="a7"/>
+    <w:basedOn w:val="Normal"/>
+    <w:next w:val="Normal"/>
+    <w:link w:val="SubtitleChar"/>
     <w:uiPriority w:val="11"/>
     <w:qFormat/>
     <w:rsid w:val="00C057C7"/>
@@ -874,10 +894,10 @@
       <w:szCs w:val="28"/>
     </w:rPr>
   </w:style>
-  <w:style w:type="character" w:customStyle="1" w:styleId="a7">
-    <w:name w:val="Подзаголовок Знак"/>
-    <w:basedOn w:val="a1"/>
-    <w:link w:val="a6"/>
+  <w:style w:type="character" w:customStyle="1" w:styleId="SubtitleChar">
+    <w:name w:val="Subtitle Char"/>
+    <w:basedOn w:val="DefaultParagraphFont"/>
+    <w:link w:val="Subtitle"/>
     <w:uiPriority w:val="11"/>
     <w:rsid w:val="00C057C7"/>
     <w:rPr>
@@ -888,11 +908,11 @@
       <w:szCs w:val="28"/>
     </w:rPr>
   </w:style>
-  <w:style w:type="paragraph" w:styleId="21">
+  <w:style w:type="paragraph" w:styleId="Quote">
     <w:name w:val="Quote"/>
-    <w:basedOn w:val="a"/>
-    <w:next w:val="a"/>
-    <w:link w:val="22"/>
+    <w:basedOn w:val="Normal"/>
+    <w:next w:val="Normal"/>
+    <w:link w:val="QuoteChar"/>
     <w:uiPriority w:val="29"/>
     <w:qFormat/>
     <w:rsid w:val="00C057C7"/>
@@ -906,10 +926,10 @@
       <w:color w:val="404040" w:themeColor="text1" w:themeTint="BF"/>
     </w:rPr>
   </w:style>
-  <w:style w:type="character" w:customStyle="1" w:styleId="22">
-    <w:name w:val="Цитата 2 Знак"/>
-    <w:basedOn w:val="a1"/>
-    <w:link w:val="21"/>
+  <w:style w:type="character" w:customStyle="1" w:styleId="QuoteChar">
+    <w:name w:val="Quote Char"/>
+    <w:basedOn w:val="DefaultParagraphFont"/>
+    <w:link w:val="Quote"/>
     <w:uiPriority w:val="29"/>
     <w:rsid w:val="00C057C7"/>
     <w:rPr>
@@ -918,9 +938,9 @@
       <w:color w:val="404040" w:themeColor="text1" w:themeTint="BF"/>
     </w:rPr>
   </w:style>
-  <w:style w:type="paragraph" w:styleId="a8">
+  <w:style w:type="paragraph" w:styleId="ListParagraph">
     <w:name w:val="List Paragraph"/>
-    <w:basedOn w:val="a"/>
+    <w:basedOn w:val="Normal"/>
     <w:uiPriority w:val="34"/>
     <w:qFormat/>
     <w:rsid w:val="00C057C7"/>
@@ -929,9 +949,9 @@
       <w:contextualSpacing/>
     </w:pPr>
   </w:style>
-  <w:style w:type="character" w:styleId="a9">
+  <w:style w:type="character" w:styleId="IntenseEmphasis">
     <w:name w:val="Intense Emphasis"/>
-    <w:basedOn w:val="a1"/>
+    <w:basedOn w:val="DefaultParagraphFont"/>
     <w:uiPriority w:val="21"/>
     <w:qFormat/>
     <w:rsid w:val="00C057C7"/>
@@ -941,11 +961,11 @@
       <w:color w:val="0F4761" w:themeColor="accent1" w:themeShade="BF"/>
     </w:rPr>
   </w:style>
-  <w:style w:type="paragraph" w:styleId="aa">
+  <w:style w:type="paragraph" w:styleId="IntenseQuote">
     <w:name w:val="Intense Quote"/>
-    <w:basedOn w:val="a"/>
-    <w:next w:val="a"/>
-    <w:link w:val="ab"/>
+    <w:basedOn w:val="Normal"/>
+    <w:next w:val="Normal"/>
+    <w:link w:val="IntenseQuoteChar"/>
     <w:uiPriority w:val="30"/>
     <w:qFormat/>
     <w:rsid w:val="00C057C7"/>
@@ -964,10 +984,10 @@
       <w:color w:val="0F4761" w:themeColor="accent1" w:themeShade="BF"/>
     </w:rPr>
   </w:style>
-  <w:style w:type="character" w:customStyle="1" w:styleId="ab">
-    <w:name w:val="Выделенная цитата Знак"/>
-    <w:basedOn w:val="a1"/>
-    <w:link w:val="aa"/>
+  <w:style w:type="character" w:customStyle="1" w:styleId="IntenseQuoteChar">
+    <w:name w:val="Intense Quote Char"/>
+    <w:basedOn w:val="DefaultParagraphFont"/>
+    <w:link w:val="IntenseQuote"/>
     <w:uiPriority w:val="30"/>
     <w:rsid w:val="00C057C7"/>
     <w:rPr>
@@ -976,9 +996,9 @@
       <w:color w:val="0F4761" w:themeColor="accent1" w:themeShade="BF"/>
     </w:rPr>
   </w:style>
-  <w:style w:type="character" w:styleId="ac">
+  <w:style w:type="character" w:styleId="IntenseReference">
     <w:name w:val="Intense Reference"/>
-    <w:basedOn w:val="a1"/>
+    <w:basedOn w:val="DefaultParagraphFont"/>
     <w:uiPriority w:val="32"/>
     <w:qFormat/>
     <w:rsid w:val="00C057C7"/>
@@ -990,7 +1010,7 @@
       <w:spacing w:val="5"/>
     </w:rPr>
   </w:style>
-  <w:style w:type="paragraph" w:styleId="a0">
+  <w:style w:type="paragraph" w:styleId="NoSpacing">
     <w:name w:val="No Spacing"/>
     <w:uiPriority w:val="1"/>
     <w:qFormat/>
@@ -1000,9 +1020,9 @@
       <w:jc w:val="right"/>
     </w:pPr>
   </w:style>
-  <w:style w:type="character" w:styleId="ad">
+  <w:style w:type="character" w:styleId="Emphasis">
     <w:name w:val="Emphasis"/>
-    <w:basedOn w:val="a1"/>
+    <w:basedOn w:val="DefaultParagraphFont"/>
     <w:uiPriority w:val="20"/>
     <w:qFormat/>
     <w:rsid w:val="00B71F69"/>

</xml_diff>